<commit_message>
Portfolio fixes — StockPilot stats, hero 24 docs, TimeClock tagline, SystemSection card 4
- StockPilot: lines of code 8,400 → 8,600, added Active Users: 4 stat
- Hero: 23 docs → 24 docs (desktop + mobile)
- TimeClock: updated tagline to GPS-verified specifics
- SystemSection: added Card 04 "Builds that stay maintainable" (desktop 4-col grid + mobile stacked)
Files changed: src/data.ts, src/components/Hero.tsx, src/components/mobile/Hero.tsx, src/components/SystemSection.tsx, src/components/mobile/SystemSection.tsx
</commit_message>
<xml_diff>
--- a/public/Valery_Lavrov_CV.docx
+++ b/public/Valery_Lavrov_CV.docx
@@ -4,7 +4,7 @@
   <w:body>
     <w:p>
       <w:pPr>
-        <w:spacing w:after="60" w:before="0"/>
+        <w:spacing w:after="50" w:before="0"/>
       </w:pPr>
       <w:r>
         <w:rPr>
@@ -75,8 +75,7 @@
           <w:szCs w:val="18"/>
         </w:rPr>
         <w:br/>
-        <w:t xml:space="preserve">
-lavrov-dev.com</w:t>
+        <w:t xml:space="preserve">lavrov-dev.com</w:t>
       </w:r>
       <w:r>
         <w:rPr>
@@ -102,12 +101,12 @@
         <w:pBdr>
           <w:bottom w:val="single" w:color="1A5276" w:sz="8" w:space="1"/>
         </w:pBdr>
-        <w:spacing w:after="80" w:before="240"/>
-      </w:pPr>
-    </w:p>
-    <w:p>
-      <w:pPr>
-        <w:spacing w:after="60" w:before="240"/>
+        <w:spacing w:after="80" w:before="260"/>
+      </w:pPr>
+    </w:p>
+    <w:p>
+      <w:pPr>
+        <w:spacing w:after="60" w:before="0"/>
       </w:pPr>
       <w:r>
         <w:rPr>
@@ -128,10 +127,13 @@
       <w:r>
         <w:rPr>
           <w:rFonts w:ascii="Arial" w:cs="Arial" w:eastAsia="Arial" w:hAnsi="Arial"/>
-          <w:sz w:val="20"/>
-          <w:szCs w:val="20"/>
-        </w:rPr>
-        <w:t xml:space="preserve">Six production apps shipped solo in three years, while working full-time. 83,000+ lines of code across workforce management, inventory control, building management, and sports analytics. I conceive, design, architect, and deploy complete products — owning the full lifecycle from user experience and data architecture through legal compliance and deployment.</w:t>
+          <w:b w:val="false"/>
+          <w:bCs w:val="false"/>
+          <w:color w:val="000000"/>
+          <w:sz w:val="20"/>
+          <w:szCs w:val="20"/>
+        </w:rPr>
+        <w:t xml:space="preserve">Six production apps shipped solo in three years, while working full-time. Each one conceived, designed, architected, and deployed from scratch — owning the full lifecycle from user experience and data architecture through legal compliance and deployment.</w:t>
       </w:r>
     </w:p>
     <w:p>
@@ -141,10 +143,13 @@
       <w:r>
         <w:rPr>
           <w:rFonts w:ascii="Arial" w:cs="Arial" w:eastAsia="Arial" w:hAnsi="Arial"/>
-          <w:sz w:val="20"/>
-          <w:szCs w:val="20"/>
-        </w:rPr>
-        <w:t xml:space="preserve">I use AI-assisted development as a core part of my process, which allows one person to operate at team-scale scope and speed. The ideas, product decisions, architecture, and quality bar are entirely mine. This process is backed by a 24-document personal methodology library — decision trees, architecture decision records, PWA guides, and session protocols — built from real production failures across 6 projects and applied to every subsequent build.</w:t>
+          <w:b w:val="false"/>
+          <w:bCs w:val="false"/>
+          <w:color w:val="000000"/>
+          <w:sz w:val="20"/>
+          <w:szCs w:val="20"/>
+        </w:rPr>
+        <w:t xml:space="preserve">I build with a repeatable workflow that improves with every project. Every bug that matters becomes a rule. Every architecture decision is documented. The next build starts with everything the previous ones learned — which means faster delivery, fewer repeated mistakes, and codebases that stay maintainable long after launch.</w:t>
       </w:r>
     </w:p>
     <w:p>
@@ -154,6 +159,9 @@
       <w:r>
         <w:rPr>
           <w:rFonts w:ascii="Arial" w:cs="Arial" w:eastAsia="Arial" w:hAnsi="Arial"/>
+          <w:b w:val="false"/>
+          <w:bCs w:val="false"/>
+          <w:color w:val="000000"/>
           <w:sz w:val="20"/>
           <w:szCs w:val="20"/>
         </w:rPr>
@@ -165,12 +173,12 @@
         <w:pBdr>
           <w:bottom w:val="single" w:color="1A5276" w:sz="8" w:space="1"/>
         </w:pBdr>
-        <w:spacing w:after="80" w:before="240"/>
-      </w:pPr>
-    </w:p>
-    <w:p>
-      <w:pPr>
-        <w:spacing w:after="60" w:before="240"/>
+        <w:spacing w:after="80" w:before="260"/>
+      </w:pPr>
+    </w:p>
+    <w:p>
+      <w:pPr>
+        <w:spacing w:after="60" w:before="0"/>
       </w:pPr>
       <w:r>
         <w:rPr>
@@ -186,7 +194,7 @@
     </w:p>
     <w:p>
       <w:pPr>
-        <w:spacing w:after="30" w:before="80"/>
+        <w:spacing w:after="20" w:before="80"/>
       </w:pPr>
       <w:r>
         <w:rPr>
@@ -258,7 +266,7 @@
           <w:sz w:val="20"/>
           <w:szCs w:val="20"/>
         </w:rPr>
-        <w:t xml:space="preserve">PIN authentication with bcrypt hashing + IndexedDB device fingerprinting; manager must approve each new device</w:t>
+        <w:t xml:space="preserve">PIN authentication with bcrypt hashing + IndexedDB device fingerprinting; manager approves each new device</w:t>
       </w:r>
     </w:p>
     <w:p>
@@ -338,12 +346,12 @@
         <w:pBdr>
           <w:bottom w:val="single" w:color="1A5276" w:sz="8" w:space="1"/>
         </w:pBdr>
-        <w:spacing w:after="80" w:before="240"/>
-      </w:pPr>
-    </w:p>
-    <w:p>
-      <w:pPr>
-        <w:spacing w:after="60" w:before="240"/>
+        <w:spacing w:after="80" w:before="260"/>
+      </w:pPr>
+    </w:p>
+    <w:p>
+      <w:pPr>
+        <w:spacing w:after="60" w:before="0"/>
       </w:pPr>
       <w:r>
         <w:rPr>
@@ -359,7 +367,7 @@
     </w:p>
     <w:p>
       <w:pPr>
-        <w:spacing w:after="30" w:before="140"/>
+        <w:spacing w:after="20" w:before="140"/>
       </w:pPr>
       <w:r>
         <w:rPr>
@@ -370,16 +378,16 @@
           <w:sz w:val="22"/>
           <w:szCs w:val="22"/>
         </w:rPr>
-        <w:t xml:space="preserve">WishBasket — Family Home Management </w:t>
+        <w:t xml:space="preserve">WishBasket — Family Home Management</w:t>
       </w:r>
       <w:r>
         <w:rPr>
           <w:rFonts w:ascii="Arial" w:cs="Arial" w:eastAsia="Arial" w:hAnsi="Arial"/>
           <w:color w:val="1A5276"/>
-          <w:sz w:val="20"/>
-          <w:szCs w:val="20"/>
-        </w:rPr>
-        <w:t xml:space="preserve"> · wishbasket.app</w:t>
+          <w:sz w:val="19"/>
+          <w:szCs w:val="19"/>
+        </w:rPr>
+        <w:t xml:space="preserve">  ·  wishbasket.app</w:t>
       </w:r>
     </w:p>
     <w:p>
@@ -395,7 +403,7 @@
           <w:sz w:val="18"/>
           <w:szCs w:val="18"/>
         </w:rPr>
-        <w:t xml:space="preserve">React 19 · TypeScript · Firebase Firestore · i18next · jsPDF · PWA  ·  ~9,100 lines · ~2 weeks, evenings</w:t>
+        <w:t xml:space="preserve">React 19 · TypeScript · Firebase · i18next · jsPDF · PWA  ·  ~9,100 lines · ~2 weeks, evenings</w:t>
       </w:r>
     </w:p>
     <w:p>
@@ -408,12 +416,12 @@
           <w:sz w:val="20"/>
           <w:szCs w:val="20"/>
         </w:rPr>
-        <w:t xml:space="preserve">Family inventory and accountability app built around the Wish Basket: any member requests an item, any other member claims it and owns the outcome — name recorded, result logged permanently and immutably at the Firestore rule level. Two-stage Request &amp; Promise flow (pending → promised → resolved) with promisedBy + promisedAt tracked separately. Folder-level ACL with zero per-item query overhead. Custom org-defined statuses. Kosher/halal tracking baked into the data model. Full Shopping Mode overlay. PWA install prompt handled for both Android (native) and iOS (manual guide fallback). 3 languages with RTL.</w:t>
-      </w:r>
-    </w:p>
-    <w:p>
-      <w:pPr>
-        <w:spacing w:after="30" w:before="140"/>
+        <w:t xml:space="preserve">Family inventory and accountability app built around one idea: any member requests an item, any other member claims it and owns the outcome — name recorded, result logged permanently at the Firestore rule level. Two-stage Request &amp; Promise flow (pending → promised → resolved). Folder-level ACL with zero per-item query overhead. Custom org-defined statuses. Kosher/halal tracking baked into the data model. Shopping Mode overlay. PWA install prompt handled for Android (native) and iOS (manual guide fallback). 3 languages with RTL.</w:t>
+      </w:r>
+    </w:p>
+    <w:p>
+      <w:pPr>
+        <w:spacing w:after="20" w:before="140"/>
       </w:pPr>
       <w:r>
         <w:rPr>
@@ -424,16 +432,16 @@
           <w:sz w:val="22"/>
           <w:szCs w:val="22"/>
         </w:rPr>
-        <w:t xml:space="preserve">StockPilot — Team Inventory Management </w:t>
+        <w:t xml:space="preserve">StockPilot — Facilities Inventory Management</w:t>
       </w:r>
       <w:r>
         <w:rPr>
           <w:rFonts w:ascii="Arial" w:cs="Arial" w:eastAsia="Arial" w:hAnsi="Arial"/>
           <w:color w:val="1A5276"/>
-          <w:sz w:val="20"/>
-          <w:szCs w:val="20"/>
-        </w:rPr>
-        <w:t xml:space="preserve"> · inventory-e5daa.web.app</w:t>
+          <w:sz w:val="19"/>
+          <w:szCs w:val="19"/>
+        </w:rPr>
+        <w:t xml:space="preserve">  ·  inventory-e5daa.web.app</w:t>
       </w:r>
     </w:p>
     <w:p>
@@ -449,7 +457,7 @@
           <w:sz w:val="18"/>
           <w:szCs w:val="18"/>
         </w:rPr>
-        <w:t xml:space="preserve">React 19 · TypeScript · Firebase · Zod · Recharts  ·  ~7,900 lines · ~2 weeks, evenings</w:t>
+        <w:t xml:space="preserve">React 19 · TypeScript · Firebase · Zod · Recharts  ·  ~8,600 lines · ~3 weeks, evenings</w:t>
       </w:r>
     </w:p>
     <w:p>
@@ -462,12 +470,12 @@
           <w:sz w:val="20"/>
           <w:szCs w:val="20"/>
         </w:rPr>
-        <w:t xml:space="preserve">Multi-role inventory system separating consumables from assets. Assets carry serial number, assignment, and repair status (working / needs_technician / decommissioned). Automatic low-stock alerts via per-item minThreshold. Immutable audit log with before/after deltas on every change. Folder-level ACL — staff see only assigned folders. Consumption analytics with Recharts. Rate-limited PDF reports. Superadmin layer for platform-level oversight. Zod for runtime schema validation. 12 Architecture Decision Records document every major technical choice.</w:t>
-      </w:r>
-    </w:p>
-    <w:p>
-      <w:pPr>
-        <w:spacing w:after="30" w:before="140"/>
+        <w:t xml:space="preserve">Multi-role inventory system for facilities teams — in active use by the maintenance team at Palo Alto Networks (189+ items tracked across 4 active users). Separates consumables from assets: assets carry serial number, assignment, and repair status (working / needs_technician / decommissioned). Automatic low-stock alerts via per-item thresholds. Immutable audit log with before/after deltas enforced at the Firestore rule level. Folder-level ACL. Consumption analytics with 3-month rolling average. Rate-limited PDF/Excel reports. 12 Architecture Decision Records document every major technical choice.</w:t>
+      </w:r>
+    </w:p>
+    <w:p>
+      <w:pPr>
+        <w:spacing w:after="20" w:before="140"/>
       </w:pPr>
       <w:r>
         <w:rPr>
@@ -478,16 +486,16 @@
           <w:sz w:val="22"/>
           <w:szCs w:val="22"/>
         </w:rPr>
-        <w:t xml:space="preserve">CourtIQ — Basketball Player Development Platform </w:t>
+        <w:t xml:space="preserve">CourtIQ — Basketball Player Development Platform</w:t>
       </w:r>
       <w:r>
         <w:rPr>
           <w:rFonts w:ascii="Arial" w:cs="Arial" w:eastAsia="Arial" w:hAnsi="Arial"/>
           <w:color w:val="1A5276"/>
-          <w:sz w:val="20"/>
-          <w:szCs w:val="20"/>
-        </w:rPr>
-        <w:t xml:space="preserve"> · court-iq.org</w:t>
+          <w:sz w:val="19"/>
+          <w:szCs w:val="19"/>
+        </w:rPr>
+        <w:t xml:space="preserve">  ·  court-iq.org</w:t>
       </w:r>
     </w:p>
     <w:p>
@@ -521,7 +529,7 @@
     </w:p>
     <w:p>
       <w:pPr>
-        <w:spacing w:after="30" w:before="140"/>
+        <w:spacing w:after="20" w:before="140"/>
       </w:pPr>
       <w:r>
         <w:rPr>
@@ -532,16 +540,16 @@
           <w:sz w:val="22"/>
           <w:szCs w:val="22"/>
         </w:rPr>
-        <w:t xml:space="preserve">MyHours — Personal Time Tracker </w:t>
+        <w:t xml:space="preserve">MyHours — Personal Time Tracker</w:t>
       </w:r>
       <w:r>
         <w:rPr>
           <w:rFonts w:ascii="Arial" w:cs="Arial" w:eastAsia="Arial" w:hAnsi="Arial"/>
           <w:color w:val="1A5276"/>
-          <w:sz w:val="20"/>
-          <w:szCs w:val="20"/>
-        </w:rPr>
-        <w:t xml:space="preserve"> · myhours PWA</w:t>
+          <w:sz w:val="19"/>
+          <w:szCs w:val="19"/>
+        </w:rPr>
+        <w:t xml:space="preserve"/>
       </w:r>
     </w:p>
     <w:p>
@@ -575,7 +583,7 @@
     </w:p>
     <w:p>
       <w:pPr>
-        <w:spacing w:after="30" w:before="140"/>
+        <w:spacing w:after="20" w:before="140"/>
       </w:pPr>
       <w:r>
         <w:rPr>
@@ -586,16 +594,16 @@
           <w:sz w:val="22"/>
           <w:szCs w:val="22"/>
         </w:rPr>
-        <w:t xml:space="preserve">Baiti — Building Management Platform </w:t>
+        <w:t xml:space="preserve">Baiti — Building Management Platform</w:t>
       </w:r>
       <w:r>
         <w:rPr>
           <w:rFonts w:ascii="Arial" w:cs="Arial" w:eastAsia="Arial" w:hAnsi="Arial"/>
           <w:color w:val="1A5276"/>
-          <w:sz w:val="20"/>
-          <w:szCs w:val="20"/>
-        </w:rPr>
-        <w:t xml:space="preserve"> · baiti.co.il</w:t>
+          <w:sz w:val="19"/>
+          <w:szCs w:val="19"/>
+        </w:rPr>
+        <w:t xml:space="preserve">  ·  baiti.co.il</w:t>
       </w:r>
     </w:p>
     <w:p>
@@ -632,12 +640,12 @@
         <w:pBdr>
           <w:bottom w:val="single" w:color="1A5276" w:sz="8" w:space="1"/>
         </w:pBdr>
-        <w:spacing w:after="80" w:before="240"/>
-      </w:pPr>
-    </w:p>
-    <w:p>
-      <w:pPr>
-        <w:spacing w:after="60" w:before="240"/>
+        <w:spacing w:after="80" w:before="260"/>
+      </w:pPr>
+    </w:p>
+    <w:p>
+      <w:pPr>
+        <w:spacing w:after="60" w:before="0"/>
       </w:pPr>
       <w:r>
         <w:rPr>
@@ -648,7 +656,23 @@
           <w:sz w:val="26"/>
           <w:szCs w:val="26"/>
         </w:rPr>
-        <w:t xml:space="preserve">METHODOLOGY SYSTEM</w:t>
+        <w:t xml:space="preserve">HOW I BUILD — THE METHODOLOGY</w:t>
+      </w:r>
+    </w:p>
+    <w:p>
+      <w:pPr>
+        <w:spacing w:after="40" w:before="60"/>
+      </w:pPr>
+      <w:r>
+        <w:rPr>
+          <w:rFonts w:ascii="Arial" w:cs="Arial" w:eastAsia="Arial" w:hAnsi="Arial"/>
+          <w:b/>
+          <w:bCs/>
+          <w:color w:val="000000"/>
+          <w:sz w:val="20"/>
+          <w:szCs w:val="20"/>
+        </w:rPr>
+        <w:t xml:space="preserve">24-document personal engineering library — built from real failures across 6 production projects.</w:t>
       </w:r>
     </w:p>
     <w:p>
@@ -658,25 +682,29 @@
       <w:r>
         <w:rPr>
           <w:rFonts w:ascii="Arial" w:cs="Arial" w:eastAsia="Arial" w:hAnsi="Arial"/>
-          <w:b/>
-          <w:bCs/>
-          <w:sz w:val="20"/>
-          <w:szCs w:val="20"/>
-        </w:rPr>
-        <w:t xml:space="preserve">24-Document Personal Engineering Library — built incrementally across 6 production projects</w:t>
-      </w:r>
-    </w:p>
-    <w:p>
-      <w:pPr>
-        <w:spacing w:after="60" w:before="40"/>
-      </w:pPr>
-      <w:r>
-        <w:rPr>
-          <w:rFonts w:ascii="Arial" w:cs="Arial" w:eastAsia="Arial" w:hAnsi="Arial"/>
-          <w:sz w:val="20"/>
-          <w:szCs w:val="20"/>
-        </w:rPr>
-        <w:t xml:space="preserve">Every significant failure, edge case, or architectural decision that mattered became a numbered document. Available to Claude Code at the start of every session — so every new project begins with all lessons from every previous project already encoded. The library includes a 6-stage decision tree (architecture gated before first commit), a session protocol that solves AI amnesia, architecture decision records (StockPilot: 12 dated ADRs), security and launch checklists, and domain-specific guides updated from real production bugs. When WishBasket found two PWA install prompt edge cases, both failures updated the shared library. The next project starts knowing what WishBasket learned.</w:t>
+          <w:b w:val="false"/>
+          <w:bCs w:val="false"/>
+          <w:color w:val="000000"/>
+          <w:sz w:val="20"/>
+          <w:szCs w:val="20"/>
+        </w:rPr>
+        <w:t xml:space="preserve">Every bug that mattered became a rule. Every architecture decision was documented with the problem, the wrong approach, and what was chosen and why. A new project starts with everything the previous ones learned — which means the sixth app was built faster and with fewer mistakes than the first, and will still be understandable a year from now without archaeology.</w:t>
+      </w:r>
+    </w:p>
+    <w:p>
+      <w:pPr>
+        <w:spacing w:after="60" w:before="60"/>
+      </w:pPr>
+      <w:r>
+        <w:rPr>
+          <w:rFonts w:ascii="Arial" w:cs="Arial" w:eastAsia="Arial" w:hAnsi="Arial"/>
+          <w:b w:val="false"/>
+          <w:bCs w:val="false"/>
+          <w:color w:val="000000"/>
+          <w:sz w:val="20"/>
+          <w:szCs w:val="20"/>
+        </w:rPr>
+        <w:t xml:space="preserve">The library includes: a 6-stage decision tree that gates architecture before the first commit, a session protocol that solves context loss between AI sessions, 12 dated Architecture Decision Records from StockPilot alone, security and launch checklists, and domain-specific guides updated from real production bugs.</w:t>
       </w:r>
     </w:p>
     <w:p>
@@ -684,12 +712,12 @@
         <w:pBdr>
           <w:bottom w:val="single" w:color="1A5276" w:sz="8" w:space="1"/>
         </w:pBdr>
-        <w:spacing w:after="80" w:before="240"/>
-      </w:pPr>
-    </w:p>
-    <w:p>
-      <w:pPr>
-        <w:spacing w:after="60" w:before="240"/>
+        <w:spacing w:after="80" w:before="260"/>
+      </w:pPr>
+    </w:p>
+    <w:p>
+      <w:pPr>
+        <w:spacing w:after="60" w:before="0"/>
       </w:pPr>
       <w:r>
         <w:rPr>
@@ -716,13 +744,13 @@
         </w:tblBorders>
       </w:tblPr>
       <w:tblGrid>
-        <w:gridCol w:w="1600"/>
-        <w:gridCol w:w="7760"/>
+        <w:gridCol w:w="1700"/>
+        <w:gridCol w:w="7660"/>
       </w:tblGrid>
       <w:tr>
         <w:tc>
           <w:tcPr>
-            <w:tcW w:type="dxa" w:w="1600"/>
+            <w:tcW w:type="dxa" w:w="1700"/>
             <w:tcBorders>
               <w:top w:val="none" w:color="FFFFFF" w:sz="0"/>
               <w:left w:val="none" w:color="FFFFFF" w:sz="0"/>
@@ -752,7 +780,7 @@
         </w:tc>
         <w:tc>
           <w:tcPr>
-            <w:tcW w:type="dxa" w:w="7760"/>
+            <w:tcW w:type="dxa" w:w="7660"/>
             <w:tcBorders>
               <w:top w:val="none" w:color="FFFFFF" w:sz="0"/>
               <w:left w:val="none" w:color="FFFFFF" w:sz="0"/>
@@ -781,7 +809,7 @@
       <w:tr>
         <w:tc>
           <w:tcPr>
-            <w:tcW w:type="dxa" w:w="1600"/>
+            <w:tcW w:type="dxa" w:w="1700"/>
             <w:tcBorders>
               <w:top w:val="none" w:color="FFFFFF" w:sz="0"/>
               <w:left w:val="none" w:color="FFFFFF" w:sz="0"/>
@@ -811,7 +839,7 @@
         </w:tc>
         <w:tc>
           <w:tcPr>
-            <w:tcW w:type="dxa" w:w="7760"/>
+            <w:tcW w:type="dxa" w:w="7660"/>
             <w:tcBorders>
               <w:top w:val="none" w:color="FFFFFF" w:sz="0"/>
               <w:left w:val="none" w:color="FFFFFF" w:sz="0"/>
@@ -840,7 +868,7 @@
       <w:tr>
         <w:tc>
           <w:tcPr>
-            <w:tcW w:type="dxa" w:w="1600"/>
+            <w:tcW w:type="dxa" w:w="1700"/>
             <w:tcBorders>
               <w:top w:val="none" w:color="FFFFFF" w:sz="0"/>
               <w:left w:val="none" w:color="FFFFFF" w:sz="0"/>
@@ -870,7 +898,7 @@
         </w:tc>
         <w:tc>
           <w:tcPr>
-            <w:tcW w:type="dxa" w:w="7760"/>
+            <w:tcW w:type="dxa" w:w="7660"/>
             <w:tcBorders>
               <w:top w:val="none" w:color="FFFFFF" w:sz="0"/>
               <w:left w:val="none" w:color="FFFFFF" w:sz="0"/>
@@ -899,7 +927,7 @@
       <w:tr>
         <w:tc>
           <w:tcPr>
-            <w:tcW w:type="dxa" w:w="1600"/>
+            <w:tcW w:type="dxa" w:w="1700"/>
             <w:tcBorders>
               <w:top w:val="none" w:color="FFFFFF" w:sz="0"/>
               <w:left w:val="none" w:color="FFFFFF" w:sz="0"/>
@@ -929,7 +957,7 @@
         </w:tc>
         <w:tc>
           <w:tcPr>
-            <w:tcW w:type="dxa" w:w="7760"/>
+            <w:tcW w:type="dxa" w:w="7660"/>
             <w:tcBorders>
               <w:top w:val="none" w:color="FFFFFF" w:sz="0"/>
               <w:left w:val="none" w:color="FFFFFF" w:sz="0"/>
@@ -958,7 +986,7 @@
       <w:tr>
         <w:tc>
           <w:tcPr>
-            <w:tcW w:type="dxa" w:w="1600"/>
+            <w:tcW w:type="dxa" w:w="1700"/>
             <w:tcBorders>
               <w:top w:val="none" w:color="FFFFFF" w:sz="0"/>
               <w:left w:val="none" w:color="FFFFFF" w:sz="0"/>
@@ -988,7 +1016,7 @@
         </w:tc>
         <w:tc>
           <w:tcPr>
-            <w:tcW w:type="dxa" w:w="7760"/>
+            <w:tcW w:type="dxa" w:w="7660"/>
             <w:tcBorders>
               <w:top w:val="none" w:color="FFFFFF" w:sz="0"/>
               <w:left w:val="none" w:color="FFFFFF" w:sz="0"/>
@@ -1009,7 +1037,7 @@
                 <w:sz w:val="18"/>
                 <w:szCs w:val="18"/>
               </w:rPr>
-              <w:t xml:space="preserve">Browser Geolocation, Haversine formula, jsPDF, SheetJS (xlsx), Recharts, Zod, Chart.js</w:t>
+              <w:t xml:space="preserve">Browser Geolocation, Haversine formula, jsPDF, SheetJS (xlsx), Recharts, Zod, Chart.js, dnd-kit</w:t>
             </w:r>
           </w:p>
         </w:tc>
@@ -1017,7 +1045,7 @@
       <w:tr>
         <w:tc>
           <w:tcPr>
-            <w:tcW w:type="dxa" w:w="1600"/>
+            <w:tcW w:type="dxa" w:w="1700"/>
             <w:tcBorders>
               <w:top w:val="none" w:color="FFFFFF" w:sz="0"/>
               <w:left w:val="none" w:color="FFFFFF" w:sz="0"/>
@@ -1047,7 +1075,7 @@
         </w:tc>
         <w:tc>
           <w:tcPr>
-            <w:tcW w:type="dxa" w:w="7760"/>
+            <w:tcW w:type="dxa" w:w="7660"/>
             <w:tcBorders>
               <w:top w:val="none" w:color="FFFFFF" w:sz="0"/>
               <w:left w:val="none" w:color="FFFFFF" w:sz="0"/>
@@ -1076,7 +1104,7 @@
       <w:tr>
         <w:tc>
           <w:tcPr>
-            <w:tcW w:type="dxa" w:w="1600"/>
+            <w:tcW w:type="dxa" w:w="1700"/>
             <w:tcBorders>
               <w:top w:val="none" w:color="FFFFFF" w:sz="0"/>
               <w:left w:val="none" w:color="FFFFFF" w:sz="0"/>
@@ -1106,7 +1134,7 @@
         </w:tc>
         <w:tc>
           <w:tcPr>
-            <w:tcW w:type="dxa" w:w="7760"/>
+            <w:tcW w:type="dxa" w:w="7660"/>
             <w:tcBorders>
               <w:top w:val="none" w:color="FFFFFF" w:sz="0"/>
               <w:left w:val="none" w:color="FFFFFF" w:sz="0"/>
@@ -1135,7 +1163,7 @@
       <w:tr>
         <w:tc>
           <w:tcPr>
-            <w:tcW w:type="dxa" w:w="1600"/>
+            <w:tcW w:type="dxa" w:w="1700"/>
             <w:tcBorders>
               <w:top w:val="none" w:color="FFFFFF" w:sz="0"/>
               <w:left w:val="none" w:color="FFFFFF" w:sz="0"/>
@@ -1165,7 +1193,7 @@
         </w:tc>
         <w:tc>
           <w:tcPr>
-            <w:tcW w:type="dxa" w:w="7760"/>
+            <w:tcW w:type="dxa" w:w="7660"/>
             <w:tcBorders>
               <w:top w:val="none" w:color="FFFFFF" w:sz="0"/>
               <w:left w:val="none" w:color="FFFFFF" w:sz="0"/>
@@ -1194,7 +1222,7 @@
       <w:tr>
         <w:tc>
           <w:tcPr>
-            <w:tcW w:type="dxa" w:w="1600"/>
+            <w:tcW w:type="dxa" w:w="1700"/>
             <w:tcBorders>
               <w:top w:val="none" w:color="FFFFFF" w:sz="0"/>
               <w:left w:val="none" w:color="FFFFFF" w:sz="0"/>
@@ -1218,13 +1246,13 @@
                 <w:sz w:val="18"/>
                 <w:szCs w:val="18"/>
               </w:rPr>
-              <w:t xml:space="preserve">Legacy/Enterprise</w:t>
+              <w:t xml:space="preserve">Legacy</w:t>
             </w:r>
           </w:p>
         </w:tc>
         <w:tc>
           <w:tcPr>
-            <w:tcW w:type="dxa" w:w="7760"/>
+            <w:tcW w:type="dxa" w:w="7660"/>
             <w:tcBorders>
               <w:top w:val="none" w:color="FFFFFF" w:sz="0"/>
               <w:left w:val="none" w:color="FFFFFF" w:sz="0"/>
@@ -1245,7 +1273,7 @@
                 <w:sz w:val="18"/>
                 <w:szCs w:val="18"/>
               </w:rPr>
-              <w:t xml:space="preserve">Apache Tomcat, WebLogic, GlassFish, Oracle Application Server</w:t>
+              <w:t xml:space="preserve">Apache Tomcat, WebLogic, GlassFish, Oracle Application Server, Java EE</w:t>
             </w:r>
           </w:p>
         </w:tc>
@@ -1256,12 +1284,12 @@
         <w:pBdr>
           <w:bottom w:val="single" w:color="1A5276" w:sz="8" w:space="1"/>
         </w:pBdr>
-        <w:spacing w:after="80" w:before="240"/>
-      </w:pPr>
-    </w:p>
-    <w:p>
-      <w:pPr>
-        <w:spacing w:after="60" w:before="240"/>
+        <w:spacing w:after="80" w:before="260"/>
+      </w:pPr>
+    </w:p>
+    <w:p>
+      <w:pPr>
+        <w:spacing w:after="60" w:before="0"/>
       </w:pPr>
       <w:r>
         <w:rPr>
@@ -1316,8 +1344,7 @@
           <w:szCs w:val="20"/>
         </w:rPr>
         <w:br/>
-        <w:t xml:space="preserve">
-Self-employed · Israel</w:t>
+        <w:t xml:space="preserve">Self-employed · Israel</w:t>
       </w:r>
     </w:p>
     <w:p>
@@ -1327,10 +1354,13 @@
       <w:r>
         <w:rPr>
           <w:rFonts w:ascii="Arial" w:cs="Arial" w:eastAsia="Arial" w:hAnsi="Arial"/>
-          <w:sz w:val="20"/>
-          <w:szCs w:val="20"/>
-        </w:rPr>
-        <w:t xml:space="preserve">Designing, building, and shipping complete production applications solo — full lifecycle from concept through deployment. Six live apps, 83,000+ lines of code.</w:t>
+          <w:b w:val="false"/>
+          <w:bCs w:val="false"/>
+          <w:color w:val="000000"/>
+          <w:sz w:val="20"/>
+          <w:szCs w:val="20"/>
+        </w:rPr>
+        <w:t xml:space="preserve">Designing, building, and shipping complete production applications solo — full lifecycle from concept through deployment. Six live apps across workforce management, inventory control, building management, and sports analytics.</w:t>
       </w:r>
     </w:p>
     <w:p>
@@ -1348,7 +1378,7 @@
           <w:sz w:val="20"/>
           <w:szCs w:val="20"/>
         </w:rPr>
-        <w:t xml:space="preserve">Built TimeClock GPS: GPS-verified workforce system, 6 user roles, 5 approval modes, payroll reporting — 18,600 lines, 31 days evenings</w:t>
+        <w:t xml:space="preserve">TimeClock GPS: GPS-verified workforce system, 6 user roles, 5 approval modes, payroll reporting — 18,600 lines, 31 days evenings</w:t>
       </w:r>
     </w:p>
     <w:p>
@@ -1366,7 +1396,7 @@
           <w:sz w:val="20"/>
           <w:szCs w:val="20"/>
         </w:rPr>
-        <w:t xml:space="preserve">Built WishBasket: family accountability app with peer Request &amp; Promise system and immutable Firestore log — live at wishbasket.app</w:t>
+        <w:t xml:space="preserve">StockPilot: facilities inventory with dual consumable/asset tracking, automatic low-stock alerts — in active use at Palo Alto Networks</w:t>
       </w:r>
     </w:p>
     <w:p>
@@ -1384,7 +1414,7 @@
           <w:sz w:val="20"/>
           <w:szCs w:val="20"/>
         </w:rPr>
-        <w:t xml:space="preserve">Built StockPilot: team inventory with dual consumable/asset tracking, automatic low-stock alerts, 12 Architecture Decision Records</w:t>
+        <w:t xml:space="preserve">WishBasket: family accountability app with peer Request &amp; Promise system and immutable Firestore log — live at wishbasket.app</w:t>
       </w:r>
     </w:p>
     <w:p>
@@ -1402,7 +1432,7 @@
           <w:sz w:val="20"/>
           <w:szCs w:val="20"/>
         </w:rPr>
-        <w:t xml:space="preserve">Built CourtIQ: basketball coaching platform with skill tracking, scouting history, and 176-skill library</w:t>
+        <w:t xml:space="preserve">CourtIQ: basketball coaching platform with skill tracking, scouting history, and 176-skill library</w:t>
       </w:r>
     </w:p>
     <w:p>
@@ -1420,7 +1450,7 @@
           <w:sz w:val="20"/>
           <w:szCs w:val="20"/>
         </w:rPr>
-        <w:t xml:space="preserve">Built Baiti: building management platform with push notifications and multilingual payment tracking</w:t>
+        <w:t xml:space="preserve">Baiti: building management platform with push notifications and multilingual payment tracking</w:t>
       </w:r>
     </w:p>
     <w:p>
@@ -1438,7 +1468,7 @@
           <w:sz w:val="20"/>
           <w:szCs w:val="20"/>
         </w:rPr>
-        <w:t xml:space="preserve">Built MyHours: personal time tracker with GPS, multi-workplace settings, and PDF/Excel payroll export</w:t>
+        <w:t xml:space="preserve">MyHours: personal time tracker with GPS, multi-workplace settings, and PDF/Excel payroll export</w:t>
       </w:r>
     </w:p>
     <w:p>
@@ -1474,8 +1504,13 @@
           <w:sz w:val="20"/>
           <w:szCs w:val="20"/>
         </w:rPr>
-        <w:t xml:space="preserve">Developed 24-document personal methodology library — decision trees, ADRs, session protocols — updated from real production failures</w:t>
-      </w:r>
+        <w:t xml:space="preserve">24-document methodology library — decision trees, ADRs, session protocols — updated from real production failures, applied to every build</w:t>
+      </w:r>
+    </w:p>
+    <w:p>
+      <w:pPr>
+        <w:spacing w:after="0" w:before="100"/>
+      </w:pPr>
     </w:p>
     <w:p>
       <w:pPr>
@@ -1518,8 +1553,7 @@
           <w:szCs w:val="20"/>
         </w:rPr>
         <w:br/>
-        <w:t xml:space="preserve">
-Palo Alto Networks (formerly CyberArk) · Petah Tikva, Israel</w:t>
+        <w:t xml:space="preserve">Palo Alto Networks (formerly CyberArk) · Petah Tikva, Israel</w:t>
       </w:r>
     </w:p>
     <w:p>
@@ -1529,10 +1563,13 @@
       <w:r>
         <w:rPr>
           <w:rFonts w:ascii="Arial" w:cs="Arial" w:eastAsia="Arial" w:hAnsi="Arial"/>
-          <w:sz w:val="20"/>
-          <w:szCs w:val="20"/>
-        </w:rPr>
-        <w:t xml:space="preserve">Facilities operations at a global cybersecurity company. Direct exposure to enterprise maintenance workflows and facility management — which directly informed StockPilot and related tooling.</w:t>
+          <w:b w:val="false"/>
+          <w:bCs w:val="false"/>
+          <w:color w:val="000000"/>
+          <w:sz w:val="20"/>
+          <w:szCs w:val="20"/>
+        </w:rPr>
+        <w:t xml:space="preserve">Facilities operations at a global cybersecurity company. Direct exposure to enterprise maintenance workflows — which directly informed StockPilot, now in active use by the same team.</w:t>
       </w:r>
     </w:p>
     <w:p>
@@ -1576,8 +1613,7 @@
           <w:szCs w:val="20"/>
         </w:rPr>
         <w:br/>
-        <w:t xml:space="preserve">
-Hapoel Lod · Israel</w:t>
+        <w:t xml:space="preserve">Hapoel Lod · Israel</w:t>
       </w:r>
     </w:p>
     <w:p>
@@ -1587,10 +1623,13 @@
       <w:r>
         <w:rPr>
           <w:rFonts w:ascii="Arial" w:cs="Arial" w:eastAsia="Arial" w:hAnsi="Arial"/>
-          <w:sz w:val="20"/>
-          <w:szCs w:val="20"/>
-        </w:rPr>
-        <w:t xml:space="preserve">Leading program transformation through systematic coaching and data-driven analytics. Strategic game planning combining basketball fundamentals with PPP-based shot efficiency analysis, pick-and-roll coverage effectiveness rankings, and position-flexible player development.</w:t>
+          <w:b w:val="false"/>
+          <w:bCs w:val="false"/>
+          <w:color w:val="000000"/>
+          <w:sz w:val="20"/>
+          <w:szCs w:val="20"/>
+        </w:rPr>
+        <w:t xml:space="preserve">Leading program transformation through systematic coaching and data-driven analytics. PPP-based shot efficiency analysis, pick-and-roll coverage effectiveness rankings, and position-flexible player development.</w:t>
       </w:r>
     </w:p>
     <w:p>
@@ -1634,8 +1673,7 @@
           <w:szCs w:val="20"/>
         </w:rPr>
         <w:br/>
-        <w:t xml:space="preserve">
-Israweb4u · Israel</w:t>
+        <w:t xml:space="preserve">Israweb4u · Israel</w:t>
       </w:r>
     </w:p>
     <w:p>
@@ -1645,6 +1683,9 @@
       <w:r>
         <w:rPr>
           <w:rFonts w:ascii="Arial" w:cs="Arial" w:eastAsia="Arial" w:hAnsi="Arial"/>
+          <w:b w:val="false"/>
+          <w:bCs w:val="false"/>
+          <w:color w:val="000000"/>
           <w:sz w:val="20"/>
           <w:szCs w:val="20"/>
         </w:rPr>
@@ -1692,8 +1733,7 @@
           <w:szCs w:val="20"/>
         </w:rPr>
         <w:br/>
-        <w:t xml:space="preserve">
-Unlimited Capital Ltd · Israel</w:t>
+        <w:t xml:space="preserve">Unlimited Capital Ltd · Israel</w:t>
       </w:r>
     </w:p>
     <w:p>
@@ -1703,6 +1743,9 @@
       <w:r>
         <w:rPr>
           <w:rFonts w:ascii="Arial" w:cs="Arial" w:eastAsia="Arial" w:hAnsi="Arial"/>
+          <w:b w:val="false"/>
+          <w:bCs w:val="false"/>
+          <w:color w:val="000000"/>
           <w:sz w:val="20"/>
           <w:szCs w:val="20"/>
         </w:rPr>
@@ -1750,8 +1793,7 @@
           <w:szCs w:val="20"/>
         </w:rPr>
         <w:br/>
-        <w:t xml:space="preserve">
-YouthTown · Auckland, New Zealand</w:t>
+        <w:t xml:space="preserve">YouthTown · Auckland, New Zealand</w:t>
       </w:r>
     </w:p>
     <w:p>
@@ -1761,6 +1803,9 @@
       <w:r>
         <w:rPr>
           <w:rFonts w:ascii="Arial" w:cs="Arial" w:eastAsia="Arial" w:hAnsi="Arial"/>
+          <w:b w:val="false"/>
+          <w:bCs w:val="false"/>
+          <w:color w:val="000000"/>
           <w:sz w:val="20"/>
           <w:szCs w:val="20"/>
         </w:rPr>
@@ -1808,8 +1853,7 @@
           <w:szCs w:val="20"/>
         </w:rPr>
         <w:br/>
-        <w:t xml:space="preserve">
-GOLF Computer Company Ltd · Israel</w:t>
+        <w:t xml:space="preserve">GOLF Computer Company Ltd · Israel</w:t>
       </w:r>
     </w:p>
     <w:p>
@@ -1853,8 +1897,7 @@
           <w:szCs w:val="20"/>
         </w:rPr>
         <w:br/>
-        <w:t xml:space="preserve">
-SKORNIK Security Ltd · Israel</w:t>
+        <w:t xml:space="preserve">SKORNIK Security Ltd · Israel</w:t>
       </w:r>
     </w:p>
     <w:p>
@@ -1898,8 +1941,7 @@
           <w:szCs w:val="20"/>
         </w:rPr>
         <w:br/>
-        <w:t xml:space="preserve">
-Self-employed · Simferopol, Ukraine</w:t>
+        <w:t xml:space="preserve">Self-employed · Simferopol, Ukraine</w:t>
       </w:r>
     </w:p>
     <w:p>
@@ -1909,6 +1951,9 @@
       <w:r>
         <w:rPr>
           <w:rFonts w:ascii="Arial" w:cs="Arial" w:eastAsia="Arial" w:hAnsi="Arial"/>
+          <w:b w:val="false"/>
+          <w:bCs w:val="false"/>
+          <w:color w:val="000000"/>
           <w:sz w:val="20"/>
           <w:szCs w:val="20"/>
         </w:rPr>
@@ -1920,12 +1965,12 @@
         <w:pBdr>
           <w:bottom w:val="single" w:color="1A5276" w:sz="8" w:space="1"/>
         </w:pBdr>
-        <w:spacing w:after="80" w:before="240"/>
-      </w:pPr>
-    </w:p>
-    <w:p>
-      <w:pPr>
-        <w:spacing w:after="60" w:before="240"/>
+        <w:spacing w:after="80" w:before="260"/>
+      </w:pPr>
+    </w:p>
+    <w:p>
+      <w:pPr>
+        <w:spacing w:after="60" w:before="0"/>
       </w:pPr>
       <w:r>
         <w:rPr>
@@ -1980,8 +2025,7 @@
           <w:szCs w:val="20"/>
         </w:rPr>
         <w:br/>
-        <w:t xml:space="preserve">
-Oracle Space · Israel</w:t>
+        <w:t xml:space="preserve">Oracle Space · Israel</w:t>
       </w:r>
     </w:p>
     <w:p>
@@ -2066,8 +2110,7 @@
           <w:szCs w:val="20"/>
         </w:rPr>
         <w:br/>
-        <w:t xml:space="preserve">
-Wingate Institute — Tel Aviv University · Israel</w:t>
+        <w:t xml:space="preserve">Wingate Institute — Tel Aviv University · Israel</w:t>
       </w:r>
     </w:p>
     <w:p>
@@ -2077,6 +2120,9 @@
       <w:r>
         <w:rPr>
           <w:rFonts w:ascii="Arial" w:cs="Arial" w:eastAsia="Arial" w:hAnsi="Arial"/>
+          <w:b w:val="false"/>
+          <w:bCs w:val="false"/>
+          <w:color w:val="000000"/>
           <w:sz w:val="20"/>
           <w:szCs w:val="20"/>
         </w:rPr>
@@ -2124,8 +2170,7 @@
           <w:szCs w:val="20"/>
         </w:rPr>
         <w:br/>
-        <w:t xml:space="preserve">
-Tavrian National University · Simferopol, Ukraine</w:t>
+        <w:t xml:space="preserve">Tavrian National University · Simferopol, Ukraine</w:t>
       </w:r>
     </w:p>
     <w:p>
@@ -2135,6 +2180,9 @@
       <w:r>
         <w:rPr>
           <w:rFonts w:ascii="Arial" w:cs="Arial" w:eastAsia="Arial" w:hAnsi="Arial"/>
+          <w:b w:val="false"/>
+          <w:bCs w:val="false"/>
+          <w:color w:val="000000"/>
           <w:sz w:val="20"/>
           <w:szCs w:val="20"/>
         </w:rPr>
@@ -2146,12 +2194,12 @@
         <w:pBdr>
           <w:bottom w:val="single" w:color="1A5276" w:sz="8" w:space="1"/>
         </w:pBdr>
-        <w:spacing w:after="80" w:before="240"/>
-      </w:pPr>
-    </w:p>
-    <w:p>
-      <w:pPr>
-        <w:spacing w:after="60" w:before="240"/>
+        <w:spacing w:after="80" w:before="260"/>
+      </w:pPr>
+    </w:p>
+    <w:p>
+      <w:pPr>
+        <w:spacing w:after="60" w:before="0"/>
       </w:pPr>
       <w:r>
         <w:rPr>

</xml_diff>

<commit_message>
CV changes and updates
</commit_message>
<xml_diff>
--- a/public/Valery_Lavrov_CV.docx
+++ b/public/Valery_Lavrov_CV.docx
@@ -844,7 +844,7 @@
           <w:szCs w:val="21"/>
           <w:rtl w:val="false"/>
         </w:rPr>
-        <w:t xml:space="preserve">Gedera  —  Coach</w:t>
+        <w:t xml:space="preserve">Maccabi Gedera  —  Head Coach, U16 and U14</w:t>
       </w:r>
     </w:p>
     <w:p>
@@ -864,7 +864,7 @@
           <w:szCs w:val="19"/>
           <w:rtl w:val="false"/>
         </w:rPr>
-        <w:t xml:space="preserve">2019 – 2020  ·  until the Corona shutdown</w:t>
+        <w:t xml:space="preserve">2018 – 2020  ·  until the Corona shutdown</w:t>
       </w:r>
     </w:p>
     <w:p>
@@ -883,7 +883,7 @@
           <w:szCs w:val="21"/>
           <w:rtl w:val="false"/>
         </w:rPr>
-        <w:t xml:space="preserve">Maccabi Rishon LeZion  —  Coach, U14 and U16</w:t>
+        <w:t xml:space="preserve">Maccabi Rishon LeZion  —  Head Coach, U16 and U14</w:t>
       </w:r>
     </w:p>
     <w:p>
@@ -903,7 +903,7 @@
           <w:szCs w:val="19"/>
           <w:rtl w:val="false"/>
         </w:rPr>
-        <w:t xml:space="preserve">2018</w:t>
+        <w:t xml:space="preserve">2017 – 2018</w:t>
       </w:r>
     </w:p>
     <w:p>
@@ -1020,7 +1020,7 @@
           <w:szCs w:val="19"/>
           <w:rtl w:val="false"/>
         </w:rPr>
-        <w:t xml:space="preserve">2010 – 2020  ·  skill-development programs, scouting, video analysis, own website</w:t>
+        <w:t xml:space="preserve">2010 – Present  ·  skill-development programs, scouting, video analysis, own website</w:t>
       </w:r>
     </w:p>
     <w:p>
@@ -1137,7 +1137,7 @@
           <w:szCs w:val="19"/>
           <w:rtl w:val="false"/>
         </w:rPr>
-        <w:t xml:space="preserve">2004  ·  earlier professional player, Maccabi Givat-Shmuel (2002)</w:t>
+        <w:t xml:space="preserve">2004</w:t>
       </w:r>
     </w:p>
     <w:p>

</xml_diff>